<commit_message>
Complete Week3/Week4 feedback fixes and split deliverables
</commit_message>
<xml_diff>
--- a/codes/docs/前四阶段交付说明.docx
+++ b/codes/docs/前四阶段交付说明.docx
@@ -17,7 +17,7 @@
     </w:p>
     <w:p>
       <w:r>
-        <w:t>交付日期：2026 年 10 月 22 日　实际周次：第二周</w:t>
+        <w:t>交付日期：2026 年 10 月 22 日　计划周次：Week 3–4</w:t>
       </w:r>
     </w:p>
     <w:p>
@@ -30,12 +30,12 @@
     </w:p>
     <w:p>
       <w:r>
-        <w:t>本次交付覆盖原八周规划的前四个任务阶段：环境与学习、最小启动、驱动与存储、镜像校验与应用跳转。其中第三、第四阶段在实际第二周提前完成。week1 至 week4 是源码及脚本中的计划阶段编号，周报统一保存在 reports/week02。</w:t>
+        <w:t>本次交付覆盖原八周规划的前四个任务阶段：环境与学习、最小启动、驱动与存储、镜像校验与应用跳转。其中第三、第四阶段归入 Week 3–4。week1 至 week4 是源码及脚本中的计划阶段编号，周报分别保存在 reports/week1-2 与 reports/week3-4。</w:t>
       </w:r>
     </w:p>
     <w:p>
       <w:r>
-        <w:t>建议先阅读第二周周报了解完成情况，再按本文运行完整启动演示，随后查阅第四阶段技术指南和各阶段测试摘要。该工程是 QEMU AN500 仿真实验，不是 SIMATIC S7 设备固件。</w:t>
+        <w:t>建议先阅读Week 3–4 周报了解完成情况，再按本文运行完整启动演示，随后查阅第四阶段技术指南和各阶段测试摘要。该工程是 QEMU AN500 仿真实验，不是 SIMATIC S7 设备固件。</w:t>
       </w:r>
     </w:p>
     <w:tbl>
@@ -164,7 +164,7 @@
                 <w:b w:val="0"/>
                 <w:sz w:val="20"/>
               </w:rPr>
-              <w:t>reports/week02/week2-report.md 和第二周实习周报.docx</w:t>
+              <w:t>reports/week3-4/week3-4-report.md 和Week3-4实习周报.docx</w:t>
             </w:r>
           </w:p>
         </w:tc>

</xml_diff>